<commit_message>
Phase 3: Dataverse, connector data; align crew IDs across sources
Dataverse crews and Lab 9 field reports now use the CREW-<REGION>-NN
IDs from the mock API. GC-06 updated with the full semantic label list.

Co-Authored-By: Claude Opus 5.5 <noreply@anthropic.com>
Claude-Session: https://claude.ai/code/session_01FkouT5fAgzdcE8NaiFmB4Y
</commit_message>
<xml_diff>
--- a/data/sharepoint/lab-09-drops/Field-Report-2026-10-01-Kingston.docx
+++ b/data/sharepoint/lab-09-drops/Field-Report-2026-10-01-Kingston.docx
@@ -175,7 +175,7 @@
               <w:rPr>
                 <w:sz w:val="20"/>
               </w:rPr>
-              <w:t>EON-LC-14</w:t>
+              <w:t>CREW-ON-03</w:t>
             </w:r>
           </w:p>
         </w:tc>
@@ -205,7 +205,7 @@
               <w:rPr>
                 <w:sz w:val="20"/>
               </w:rPr>
-              <w:t>Marcus Delaney</w:t>
+              <w:t>Devon Achebe</w:t>
             </w:r>
           </w:p>
         </w:tc>

</xml_diff>